<commit_message>
release: docx skill python-docx 重写
- SKILL.md: "Creating New Documents" 改为 python-docx 为主、npm docx 为备选
- 新增 set_ea_font() 解决 MS 明朝回退问题
- 修正表格宽度和元素顺序
- Critical Rules 扩展至 18 条
- 新增 inspect_template_format.py 模板探查工具

Co-Authored-By: Claude <noreply@anthropic.com>
</commit_message>
<xml_diff>
--- a/references/roles/论文手/references/论文模板.docx
+++ b/references/roles/论文手/references/论文模板.docx
@@ -450,16 +450,16 @@
         <w:textAlignment w:val="auto"/>
         <w:rPr>
           <w:rFonts w:hint="eastAsia"/>
-          <w:sz w:val="24"/>
-          <w:szCs w:val="24"/>
-          <w:lang w:val="en-US" w:eastAsia="zh-CN"/>
-        </w:rPr>
-      </w:pPr>
-      <w:r>
-        <w:rPr>
-          <w:rFonts w:hint="eastAsia"/>
-          <w:sz w:val="24"/>
-          <w:szCs w:val="24"/>
+          <w:sz w:val="28"/>
+          <w:szCs w:val="28"/>
+          <w:lang w:val="en-US" w:eastAsia="zh-CN"/>
+        </w:rPr>
+      </w:pPr>
+      <w:r>
+        <w:rPr>
+          <w:rFonts w:hint="eastAsia"/>
+          <w:sz w:val="28"/>
+          <w:szCs w:val="28"/>
           <w:lang w:val="en-US" w:eastAsia="zh-CN"/>
         </w:rPr>
         <w:t>1.1 问题背景</w:t>
@@ -535,16 +535,16 @@
         <w:textAlignment w:val="auto"/>
         <w:rPr>
           <w:rFonts w:hint="eastAsia"/>
-          <w:sz w:val="24"/>
-          <w:szCs w:val="24"/>
-          <w:lang w:val="en-US" w:eastAsia="zh-CN"/>
-        </w:rPr>
-      </w:pPr>
-      <w:r>
-        <w:rPr>
-          <w:rFonts w:hint="eastAsia"/>
-          <w:sz w:val="24"/>
-          <w:szCs w:val="24"/>
+          <w:sz w:val="28"/>
+          <w:szCs w:val="28"/>
+          <w:lang w:val="en-US" w:eastAsia="zh-CN"/>
+        </w:rPr>
+      </w:pPr>
+      <w:r>
+        <w:rPr>
+          <w:rFonts w:hint="eastAsia"/>
+          <w:sz w:val="28"/>
+          <w:szCs w:val="28"/>
           <w:lang w:val="en-US" w:eastAsia="zh-CN"/>
         </w:rPr>
         <w:t>1.2 问题重述</w:t>
@@ -729,16 +729,16 @@
         <w:textAlignment w:val="auto"/>
         <w:rPr>
           <w:rFonts w:hint="eastAsia"/>
-          <w:sz w:val="24"/>
-          <w:szCs w:val="24"/>
-          <w:lang w:val="en-US" w:eastAsia="zh-CN"/>
-        </w:rPr>
-      </w:pPr>
-      <w:r>
-        <w:rPr>
-          <w:rFonts w:hint="eastAsia"/>
-          <w:sz w:val="24"/>
-          <w:szCs w:val="24"/>
+          <w:sz w:val="28"/>
+          <w:szCs w:val="28"/>
+          <w:lang w:val="en-US" w:eastAsia="zh-CN"/>
+        </w:rPr>
+      </w:pPr>
+      <w:r>
+        <w:rPr>
+          <w:rFonts w:hint="eastAsia"/>
+          <w:sz w:val="28"/>
+          <w:szCs w:val="28"/>
           <w:lang w:val="en-US" w:eastAsia="zh-CN"/>
         </w:rPr>
         <w:t>1.3 问题要求</w:t>
@@ -768,8 +768,6 @@
           <w:lang w:val="en-US" w:eastAsia="zh-CN"/>
         </w:rPr>
       </w:pPr>
-      <w:bookmarkStart w:id="8" w:name="_GoBack"/>
-      <w:bookmarkEnd w:id="8"/>
     </w:p>
     <w:p>
       <w:pPr>
@@ -1734,8 +1732,8 @@
           <w:rFonts w:hint="eastAsia"/>
           <w:b w:val="0"/>
           <w:bCs w:val="0"/>
-          <w:sz w:val="24"/>
-          <w:szCs w:val="24"/>
+          <w:sz w:val="28"/>
+          <w:szCs w:val="28"/>
           <w:lang w:val="en-US" w:eastAsia="zh-CN"/>
         </w:rPr>
       </w:pPr>
@@ -1744,8 +1742,8 @@
           <w:rFonts w:hint="eastAsia"/>
           <w:b w:val="0"/>
           <w:bCs w:val="0"/>
-          <w:sz w:val="24"/>
-          <w:szCs w:val="24"/>
+          <w:sz w:val="28"/>
+          <w:szCs w:val="28"/>
           <w:lang w:val="en-US" w:eastAsia="zh-CN"/>
         </w:rPr>
         <w:t>问题一的建立</w:t>
@@ -1809,8 +1807,8 @@
           <w:rFonts w:hint="default"/>
           <w:b w:val="0"/>
           <w:bCs w:val="0"/>
-          <w:sz w:val="24"/>
-          <w:szCs w:val="24"/>
+          <w:sz w:val="28"/>
+          <w:szCs w:val="28"/>
           <w:lang w:val="en-US" w:eastAsia="zh-CN"/>
         </w:rPr>
       </w:pPr>
@@ -1819,8 +1817,8 @@
           <w:rFonts w:hint="eastAsia"/>
           <w:b w:val="0"/>
           <w:bCs w:val="0"/>
-          <w:sz w:val="24"/>
-          <w:szCs w:val="24"/>
+          <w:sz w:val="28"/>
+          <w:szCs w:val="28"/>
           <w:lang w:val="en-US" w:eastAsia="zh-CN"/>
         </w:rPr>
         <w:t>问题一的求解</w:t>
@@ -1943,8 +1941,8 @@
           <w:rFonts w:hint="eastAsia"/>
           <w:b w:val="0"/>
           <w:bCs w:val="0"/>
-          <w:sz w:val="24"/>
-          <w:szCs w:val="24"/>
+          <w:sz w:val="28"/>
+          <w:szCs w:val="28"/>
           <w:lang w:val="en-US" w:eastAsia="zh-CN"/>
         </w:rPr>
       </w:pPr>
@@ -1953,8 +1951,8 @@
           <w:rFonts w:hint="eastAsia"/>
           <w:b w:val="0"/>
           <w:bCs w:val="0"/>
-          <w:sz w:val="24"/>
-          <w:szCs w:val="24"/>
+          <w:sz w:val="28"/>
+          <w:szCs w:val="28"/>
           <w:lang w:val="en-US" w:eastAsia="zh-CN"/>
         </w:rPr>
         <w:t>1.1 问题二的建立</w:t>
@@ -2018,8 +2016,8 @@
           <w:rFonts w:hint="eastAsia"/>
           <w:b w:val="0"/>
           <w:bCs w:val="0"/>
-          <w:sz w:val="24"/>
-          <w:szCs w:val="24"/>
+          <w:sz w:val="28"/>
+          <w:szCs w:val="28"/>
           <w:lang w:val="en-US" w:eastAsia="zh-CN"/>
         </w:rPr>
       </w:pPr>
@@ -2028,8 +2026,8 @@
           <w:rFonts w:hint="eastAsia"/>
           <w:b w:val="0"/>
           <w:bCs w:val="0"/>
-          <w:sz w:val="24"/>
-          <w:szCs w:val="24"/>
+          <w:sz w:val="28"/>
+          <w:szCs w:val="28"/>
           <w:lang w:val="en-US" w:eastAsia="zh-CN"/>
         </w:rPr>
         <w:t>1.2 问题二的求解</w:t>
@@ -2133,16 +2131,16 @@
         <w:textAlignment w:val="auto"/>
         <w:rPr>
           <w:rFonts w:hint="eastAsia"/>
-          <w:sz w:val="24"/>
-          <w:szCs w:val="24"/>
-          <w:lang w:val="en-US" w:eastAsia="zh-CN"/>
-        </w:rPr>
-      </w:pPr>
-      <w:r>
-        <w:rPr>
-          <w:rFonts w:hint="eastAsia"/>
-          <w:sz w:val="24"/>
-          <w:szCs w:val="24"/>
+          <w:sz w:val="28"/>
+          <w:szCs w:val="28"/>
+          <w:lang w:val="en-US" w:eastAsia="zh-CN"/>
+        </w:rPr>
+      </w:pPr>
+      <w:r>
+        <w:rPr>
+          <w:rFonts w:hint="eastAsia"/>
+          <w:sz w:val="28"/>
+          <w:szCs w:val="28"/>
           <w:lang w:val="en-US" w:eastAsia="zh-CN"/>
         </w:rPr>
         <w:t>1.1 问题三模型的建立</w:t>
@@ -2194,16 +2192,16 @@
         <w:textAlignment w:val="auto"/>
         <w:rPr>
           <w:rFonts w:hint="default"/>
-          <w:sz w:val="24"/>
-          <w:szCs w:val="24"/>
-          <w:lang w:val="en-US" w:eastAsia="zh-CN"/>
-        </w:rPr>
-      </w:pPr>
-      <w:r>
-        <w:rPr>
-          <w:rFonts w:hint="eastAsia"/>
-          <w:sz w:val="24"/>
-          <w:szCs w:val="24"/>
+          <w:sz w:val="28"/>
+          <w:szCs w:val="28"/>
+          <w:lang w:val="en-US" w:eastAsia="zh-CN"/>
+        </w:rPr>
+      </w:pPr>
+      <w:r>
+        <w:rPr>
+          <w:rFonts w:hint="eastAsia"/>
+          <w:sz w:val="28"/>
+          <w:szCs w:val="28"/>
           <w:lang w:val="en-US" w:eastAsia="zh-CN"/>
         </w:rPr>
         <w:t>1.2 问题三的求解</w:t>
@@ -2321,16 +2319,16 @@
         <w:textAlignment w:val="auto"/>
         <w:rPr>
           <w:rFonts w:hint="eastAsia"/>
-          <w:sz w:val="24"/>
-          <w:szCs w:val="24"/>
-          <w:lang w:val="en-US" w:eastAsia="zh-CN"/>
-        </w:rPr>
-      </w:pPr>
-      <w:r>
-        <w:rPr>
-          <w:rFonts w:hint="eastAsia"/>
-          <w:sz w:val="24"/>
-          <w:szCs w:val="24"/>
+          <w:sz w:val="28"/>
+          <w:szCs w:val="28"/>
+          <w:lang w:val="en-US" w:eastAsia="zh-CN"/>
+        </w:rPr>
+      </w:pPr>
+      <w:r>
+        <w:rPr>
+          <w:rFonts w:hint="eastAsia"/>
+          <w:sz w:val="28"/>
+          <w:szCs w:val="28"/>
           <w:lang w:val="en-US" w:eastAsia="zh-CN"/>
         </w:rPr>
         <w:t>7.1 模型的优点</w:t>
@@ -2380,16 +2378,16 @@
         <w:textAlignment w:val="auto"/>
         <w:rPr>
           <w:rFonts w:hint="eastAsia"/>
-          <w:sz w:val="24"/>
-          <w:szCs w:val="24"/>
-          <w:lang w:val="en-US" w:eastAsia="zh-CN"/>
-        </w:rPr>
-      </w:pPr>
-      <w:r>
-        <w:rPr>
-          <w:rFonts w:hint="eastAsia"/>
-          <w:sz w:val="24"/>
-          <w:szCs w:val="24"/>
+          <w:sz w:val="28"/>
+          <w:szCs w:val="28"/>
+          <w:lang w:val="en-US" w:eastAsia="zh-CN"/>
+        </w:rPr>
+      </w:pPr>
+      <w:r>
+        <w:rPr>
+          <w:rFonts w:hint="eastAsia"/>
+          <w:sz w:val="28"/>
+          <w:szCs w:val="28"/>
           <w:lang w:val="en-US" w:eastAsia="zh-CN"/>
         </w:rPr>
         <w:t>7.2 模型的缺点</w:t>
@@ -2439,16 +2437,16 @@
         <w:textAlignment w:val="auto"/>
         <w:rPr>
           <w:rFonts w:hint="eastAsia"/>
-          <w:sz w:val="24"/>
-          <w:szCs w:val="24"/>
-          <w:lang w:val="en-US" w:eastAsia="zh-CN"/>
-        </w:rPr>
-      </w:pPr>
-      <w:r>
-        <w:rPr>
-          <w:rFonts w:hint="eastAsia"/>
-          <w:sz w:val="24"/>
-          <w:szCs w:val="24"/>
+          <w:sz w:val="28"/>
+          <w:szCs w:val="28"/>
+          <w:lang w:val="en-US" w:eastAsia="zh-CN"/>
+        </w:rPr>
+      </w:pPr>
+      <w:r>
+        <w:rPr>
+          <w:rFonts w:hint="eastAsia"/>
+          <w:sz w:val="28"/>
+          <w:szCs w:val="28"/>
           <w:lang w:val="en-US" w:eastAsia="zh-CN"/>
         </w:rPr>
         <w:t>7.3 模型的改进</w:t>
@@ -2585,7 +2583,20 @@
           <w:szCs w:val="32"/>
           <w:lang w:val="en-US" w:eastAsia="zh-CN"/>
         </w:rPr>
-        <w:t>附录</w:t>
+        <w:t>附</w:t>
+      </w:r>
+      <w:bookmarkStart w:id="8" w:name="_GoBack"/>
+      <w:bookmarkEnd w:id="8"/>
+      <w:r>
+        <w:rPr>
+          <w:rFonts w:hint="eastAsia"/>
+          <w:b/>
+          <w:bCs/>
+          <w:sz w:val="32"/>
+          <w:szCs w:val="32"/>
+          <w:lang w:val="en-US" w:eastAsia="zh-CN"/>
+        </w:rPr>
+        <w:t>录</w:t>
       </w:r>
       <w:bookmarkEnd w:id="7"/>
     </w:p>

</xml_diff>